<commit_message>
Add screening question to survey and a DTI/DICT request letter template
Survey A now opens with a screening question for online sellers and ends
with a referral question; the researcher's guide explains sampling and
screening. The request letter asks DTI, DICT-CAR and the city office to
forward the survey link, with message templates for Facebook outreach.

Co-Authored-By: Claude Opus 5.5 <noreply@anthropic.com>
Claude-Session: https://claude.ai/code/session_013E49sPYUyrRbFMqwEdxWwu
</commit_message>
<xml_diff>
--- a/research/Lagera_Survey_Questionnaire_AI_Customer_Support.docx
+++ b/research/Lagera_Survey_Questionnaire_AI_Customer_Support.docx
@@ -302,6 +302,99 @@
         </w:rPr>
         <w:t>To be answered before the prototype is built. Please check (✓) the box that applies or write your answer on the line.</w:t>
       </w:r>
+    </w:p>
+    <w:p>
+      <w:pPr>
+        <w:pStyle w:val="Heading2"/>
+      </w:pPr>
+      <w:r>
+        <w:t>Screening Question</w:t>
+      </w:r>
+    </w:p>
+    <w:p>
+      <w:pPr>
+        <w:keepNext/>
+        <w:spacing w:after="60"/>
+      </w:pPr>
+      <w:r>
+        <w:rPr>
+          <w:b/>
+          <w:i w:val="0"/>
+        </w:rPr>
+        <w:t xml:space="preserve">S1. </w:t>
+      </w:r>
+      <w:r>
+        <w:rPr>
+          <w:b w:val="0"/>
+          <w:i w:val="0"/>
+        </w:rPr>
+        <w:t>Do you sell products, or receive customer orders or inquiries, through any online channel (Facebook page, Messenger, Facebook Marketplace, Instagram, TikTok, Shopee, Lazada, Viber, or a website)?</w:t>
+      </w:r>
+    </w:p>
+    <w:tbl>
+      <w:tblPr>
+        <w:tblW w:type="auto" w:w="0"/>
+        <w:jc w:val="right"/>
+        <w:tblLayout w:type="fixed"/>
+        <w:tblLook w:firstColumn="1" w:firstRow="1" w:lastColumn="0" w:lastRow="0" w:noHBand="0" w:noVBand="1" w:val="04A0"/>
+      </w:tblPr>
+      <w:tblGrid>
+        <w:gridCol w:w="9000"/>
+      </w:tblGrid>
+      <w:tr>
+        <w:trPr>
+          <w:cantSplit/>
+        </w:trPr>
+        <w:tc>
+          <w:tcPr>
+            <w:tcW w:type="dxa" w:w="9000"/>
+          </w:tcPr>
+          <w:p>
+            <w:pPr>
+              <w:keepNext/>
+              <w:spacing w:after="0"/>
+              <w:jc w:val="left"/>
+            </w:pPr>
+            <w:r/>
+            <w:r>
+              <w:rPr>
+                <w:b w:val="0"/>
+                <w:sz w:val="21"/>
+              </w:rPr>
+              <w:t>☐  Yes. Please continue to Part I.</w:t>
+            </w:r>
+          </w:p>
+        </w:tc>
+      </w:tr>
+      <w:tr>
+        <w:trPr>
+          <w:cantSplit/>
+        </w:trPr>
+        <w:tc>
+          <w:tcPr>
+            <w:tcW w:type="dxa" w:w="9000"/>
+          </w:tcPr>
+          <w:p>
+            <w:pPr>
+              <w:spacing w:after="0"/>
+              <w:jc w:val="left"/>
+            </w:pPr>
+            <w:r/>
+            <w:r>
+              <w:rPr>
+                <w:b w:val="0"/>
+                <w:sz w:val="21"/>
+              </w:rPr>
+              <w:t>☐  No. Thank you for your time. You may stop here. (Optional) Main reason for not selling online: ____________________</w:t>
+            </w:r>
+          </w:p>
+        </w:tc>
+      </w:tr>
+    </w:tbl>
+    <w:p>
+      <w:pPr>
+        <w:spacing w:after="40"/>
+      </w:pPr>
     </w:p>
     <w:p>
       <w:pPr>
@@ -9644,6 +9737,43 @@
     </w:p>
     <w:p>
       <w:pPr>
+        <w:keepNext/>
+        <w:spacing w:after="40"/>
+      </w:pPr>
+      <w:r>
+        <w:rPr>
+          <w:b/>
+          <w:i w:val="0"/>
+        </w:rPr>
+        <w:t xml:space="preserve">29. </w:t>
+      </w:r>
+      <w:r>
+        <w:rPr>
+          <w:b w:val="0"/>
+          <w:i w:val="0"/>
+        </w:rPr>
+        <w:t>Do you know other online sellers in Baguio City or Benguet who might be willing to answer this survey? (Optional: page name or contact, shared only with their permission)</w:t>
+      </w:r>
+    </w:p>
+    <w:p>
+      <w:pPr>
+        <w:tabs>
+          <w:tab w:pos="9360" w:val="right" w:leader="underscore"/>
+        </w:tabs>
+        <w:spacing w:before="160" w:after="40"/>
+        <w:ind w:left="360"/>
+      </w:pPr>
+      <w:r>
+        <w:tab/>
+      </w:r>
+    </w:p>
+    <w:p>
+      <w:pPr>
+        <w:spacing w:after="0"/>
+      </w:pPr>
+    </w:p>
+    <w:p>
+      <w:pPr>
         <w:jc w:val="center"/>
       </w:pPr>
       <w:r>
@@ -16903,6 +17033,46 @@
       <w:pPr>
         <w:spacing w:after="40"/>
       </w:pPr>
+    </w:p>
+    <w:p>
+      <w:pPr>
+        <w:pStyle w:val="Heading2"/>
+      </w:pPr>
+      <w:r>
+        <w:t>Sampling and screening</w:t>
+      </w:r>
+    </w:p>
+    <w:p>
+      <w:pPr>
+        <w:pStyle w:val="ListBullet"/>
+      </w:pPr>
+      <w:r>
+        <w:t>Sampling is purposive: only businesses that sell or take inquiries through an online channel are included. Referral (snowball) sampling is used through the last question of Survey A.</w:t>
+      </w:r>
+    </w:p>
+    <w:p>
+      <w:pPr>
+        <w:pStyle w:val="ListBullet"/>
+      </w:pPr>
+      <w:r>
+        <w:t>Respondents who answer "No" to S1 are excluded from the analysis. Count them and report the reasons given, but do not include them in the Survey A percentages or means.</w:t>
+      </w:r>
+    </w:p>
+    <w:p>
+      <w:pPr>
+        <w:pStyle w:val="ListBullet"/>
+      </w:pPr>
+      <w:r>
+        <w:t>In Google Forms, set S1 to "Go to section based on answer" so that a "No" answer skips to the end.</w:t>
+      </w:r>
+    </w:p>
+    <w:p>
+      <w:pPr>
+        <w:pStyle w:val="ListBullet"/>
+      </w:pPr>
+      <w:r>
+        <w:t>Report the recruitment channels used (DTI/Negosyo Center, DICT-CAR, city office, Facebook groups, bazaars, referrals) and how many responses came from each.</w:t>
+      </w:r>
     </w:p>
     <w:p>
       <w:pPr>

</xml_diff>